<commit_message>
Update README and updated User manual
</commit_message>
<xml_diff>
--- a/Afterimage_User_Manual.docx
+++ b/Afterimage_User_Manual.docx
@@ -47,8 +47,19 @@
         <w:t>NVIDIA CUDA capable GPU</w:t>
       </w:r>
       <w:r>
-        <w:t xml:space="preserve"> with at least 12GB of  VRAM</w:t>
-      </w:r>
+        <w:t xml:space="preserve"> with at least 1</w:t>
+      </w:r>
+      <w:r>
+        <w:t>6</w:t>
+      </w:r>
+      <w:r>
+        <w:t xml:space="preserve">GB </w:t>
+      </w:r>
+      <w:proofErr w:type="gramStart"/>
+      <w:r>
+        <w:t>of  VRAM</w:t>
+      </w:r>
+      <w:proofErr w:type="gramEnd"/>
     </w:p>
     <w:p/>
     <w:p>
@@ -193,8 +204,102 @@
       </w:hyperlink>
     </w:p>
     <w:p>
-      <w:r>
-        <w:t>As of April 2026 for Nvidia GPUs:</w:t>
+      <w:pPr>
+        <w:keepNext/>
+      </w:pPr>
+      <w:r>
+        <w:rPr>
+          <w:noProof/>
+        </w:rPr>
+        <w:drawing>
+          <wp:inline distT="0" distB="0" distL="0" distR="0" wp14:anchorId="1A4A51D8" wp14:editId="3F3E14B6">
+            <wp:extent cx="5486400" cy="1869440"/>
+            <wp:effectExtent l="0" t="0" r="0" b="0"/>
+            <wp:docPr id="1806318524" name="Picture 1"/>
+            <wp:cNvGraphicFramePr>
+              <a:graphicFrameLocks xmlns:a="http://schemas.openxmlformats.org/drawingml/2006/main" noChangeAspect="1"/>
+            </wp:cNvGraphicFramePr>
+            <a:graphic xmlns:a="http://schemas.openxmlformats.org/drawingml/2006/main">
+              <a:graphicData uri="http://schemas.openxmlformats.org/drawingml/2006/picture">
+                <pic:pic xmlns:pic="http://schemas.openxmlformats.org/drawingml/2006/picture">
+                  <pic:nvPicPr>
+                    <pic:cNvPr id="1806318524" name=""/>
+                    <pic:cNvPicPr/>
+                  </pic:nvPicPr>
+                  <pic:blipFill>
+                    <a:blip r:embed="rId7"/>
+                    <a:stretch>
+                      <a:fillRect/>
+                    </a:stretch>
+                  </pic:blipFill>
+                  <pic:spPr>
+                    <a:xfrm>
+                      <a:off x="0" y="0"/>
+                      <a:ext cx="5486400" cy="1869440"/>
+                    </a:xfrm>
+                    <a:prstGeom prst="rect">
+                      <a:avLst/>
+                    </a:prstGeom>
+                  </pic:spPr>
+                </pic:pic>
+              </a:graphicData>
+            </a:graphic>
+          </wp:inline>
+        </w:drawing>
+      </w:r>
+    </w:p>
+    <w:p>
+      <w:pPr>
+        <w:pStyle w:val="Caption"/>
+        <w:jc w:val="center"/>
+      </w:pPr>
+      <w:r>
+        <w:t xml:space="preserve">Figure </w:t>
+      </w:r>
+      <w:r>
+        <w:fldChar w:fldCharType="begin"/>
+      </w:r>
+      <w:r>
+        <w:instrText xml:space="preserve"> SEQ Figure \* ARABIC </w:instrText>
+      </w:r>
+      <w:r>
+        <w:fldChar w:fldCharType="separate"/>
+      </w:r>
+      <w:r>
+        <w:rPr>
+          <w:noProof/>
+        </w:rPr>
+        <w:t>1</w:t>
+      </w:r>
+      <w:r>
+        <w:fldChar w:fldCharType="end"/>
+      </w:r>
+      <w:r>
+        <w:t xml:space="preserve">: </w:t>
+      </w:r>
+      <w:r>
+        <w:t xml:space="preserve">Use the </w:t>
+      </w:r>
+      <w:proofErr w:type="spellStart"/>
+      <w:r>
+        <w:t>PyTorch</w:t>
+      </w:r>
+      <w:proofErr w:type="spellEnd"/>
+      <w:r>
+        <w:t xml:space="preserve"> website's interactive matrix to verify the correct installation command</w:t>
+      </w:r>
+    </w:p>
+    <w:p>
+      <w:r>
+        <w:t xml:space="preserve">As of </w:t>
+      </w:r>
+      <w:proofErr w:type="gramStart"/>
+      <w:r>
+        <w:t>April 2026</w:t>
+      </w:r>
+      <w:proofErr w:type="gramEnd"/>
+      <w:r>
+        <w:t xml:space="preserve"> for Nvidia GPUs:</w:t>
       </w:r>
     </w:p>
     <w:p>
@@ -237,7 +342,7 @@
         </w:rPr>
         <w:t xml:space="preserve"> </w:t>
       </w:r>
-      <w:hyperlink r:id="rId7" w:history="1">
+      <w:hyperlink r:id="rId8" w:history="1">
         <w:r>
           <w:rPr>
             <w:rStyle w:val="Hyperlink"/>
@@ -271,6 +376,7 @@
           <w:b/>
           <w:sz w:val="28"/>
         </w:rPr>
+        <w:lastRenderedPageBreak/>
         <w:t xml:space="preserve">4. Install </w:t>
       </w:r>
       <w:proofErr w:type="spellStart"/>
@@ -375,7 +481,25 @@
           <w:sz w:val="24"/>
           <w:szCs w:val="20"/>
         </w:rPr>
-        <w:t>After the installation of different packages, Pytorch defaults to CPU as the device, hence we have to re-</w:t>
+        <w:t xml:space="preserve">After the installation of different packages, Pytorch defaults to CPU as the device, hence we </w:t>
+      </w:r>
+      <w:proofErr w:type="gramStart"/>
+      <w:r>
+        <w:rPr>
+          <w:bCs/>
+          <w:sz w:val="24"/>
+          <w:szCs w:val="20"/>
+        </w:rPr>
+        <w:t>have to</w:t>
+      </w:r>
+      <w:proofErr w:type="gramEnd"/>
+      <w:r>
+        <w:rPr>
+          <w:bCs/>
+          <w:sz w:val="24"/>
+          <w:szCs w:val="20"/>
+        </w:rPr>
+        <w:t xml:space="preserve"> re-</w:t>
       </w:r>
       <w:r>
         <w:t xml:space="preserve">install the latest </w:t>
@@ -390,7 +514,7 @@
       </w:r>
     </w:p>
     <w:p>
-      <w:hyperlink r:id="rId8" w:history="1">
+      <w:hyperlink r:id="rId9" w:history="1">
         <w:r>
           <w:rPr>
             <w:rStyle w:val="Hyperlink"/>
@@ -401,7 +525,15 @@
     </w:p>
     <w:p>
       <w:r>
-        <w:t>As of April 2026 for Nvidia GPUs:</w:t>
+        <w:t xml:space="preserve">As of </w:t>
+      </w:r>
+      <w:proofErr w:type="gramStart"/>
+      <w:r>
+        <w:t>April 2026</w:t>
+      </w:r>
+      <w:proofErr w:type="gramEnd"/>
+      <w:r>
+        <w:t xml:space="preserve"> for Nvidia GPUs:</w:t>
       </w:r>
     </w:p>
     <w:p>
@@ -444,7 +576,7 @@
         </w:rPr>
         <w:t xml:space="preserve"> </w:t>
       </w:r>
-      <w:hyperlink r:id="rId9" w:history="1">
+      <w:hyperlink r:id="rId10" w:history="1">
         <w:r>
           <w:rPr>
             <w:rStyle w:val="Hyperlink"/>
@@ -466,7 +598,6 @@
           <w:b/>
           <w:sz w:val="28"/>
         </w:rPr>
-        <w:lastRenderedPageBreak/>
         <w:t>6</w:t>
       </w:r>
       <w:r>
@@ -479,7 +610,15 @@
     </w:p>
     <w:p>
       <w:r>
-        <w:t>To be able to get the token need, create/log-in to a hugging face account. Settings -&gt;  Access tokens -&gt; create new token</w:t>
+        <w:t>To be able to get the token need, create/log-in to a hugging face account. Settings -</w:t>
+      </w:r>
+      <w:proofErr w:type="gramStart"/>
+      <w:r>
+        <w:t>&gt;  Access</w:t>
+      </w:r>
+      <w:proofErr w:type="gramEnd"/>
+      <w:r>
+        <w:t xml:space="preserve"> tokens -&gt; create new token</w:t>
       </w:r>
       <w:r>
         <w:t xml:space="preserve"> -&gt; select the below options and scroll down to -&gt; create token -&gt; copy token and after entering the command </w:t>
@@ -500,6 +639,9 @@
       </w:r>
     </w:p>
     <w:p>
+      <w:pPr>
+        <w:keepNext/>
+      </w:pPr>
       <w:r>
         <w:rPr>
           <w:noProof/>
@@ -520,7 +662,7 @@
                     <pic:cNvPicPr/>
                   </pic:nvPicPr>
                   <pic:blipFill>
-                    <a:blip r:embed="rId10"/>
+                    <a:blip r:embed="rId11"/>
                     <a:stretch>
                       <a:fillRect/>
                     </a:stretch>
@@ -542,6 +684,51 @@
       </w:r>
     </w:p>
     <w:p>
+      <w:pPr>
+        <w:pStyle w:val="Caption"/>
+        <w:jc w:val="center"/>
+      </w:pPr>
+      <w:r>
+        <w:t xml:space="preserve">Figure </w:t>
+      </w:r>
+      <w:r>
+        <w:fldChar w:fldCharType="begin"/>
+      </w:r>
+      <w:r>
+        <w:instrText xml:space="preserve"> SEQ Figure \* ARABIC </w:instrText>
+      </w:r>
+      <w:r>
+        <w:fldChar w:fldCharType="separate"/>
+      </w:r>
+      <w:r>
+        <w:rPr>
+          <w:noProof/>
+        </w:rPr>
+        <w:t>2</w:t>
+      </w:r>
+      <w:r>
+        <w:fldChar w:fldCharType="end"/>
+      </w:r>
+      <w:r>
+        <w:t xml:space="preserve">: </w:t>
+      </w:r>
+      <w:r>
+        <w:t>Navigate to Settings &gt; Access Tokens</w:t>
+      </w:r>
+      <w:r>
+        <w:t xml:space="preserve"> &gt; Create ne</w:t>
+      </w:r>
+      <w:r>
+        <w:t>w</w:t>
+      </w:r>
+      <w:r>
+        <w:t xml:space="preserve"> token</w:t>
+      </w:r>
+      <w:r>
+        <w:t xml:space="preserve"> on Hugging Face and select the required read/write permissions</w:t>
+      </w:r>
+    </w:p>
+    <w:p>
       <w:r>
         <w:rPr>
           <w:b/>
@@ -569,8 +756,107 @@
       </w:r>
     </w:p>
     <w:p>
-      <w:r>
-        <w:t>Open a NEW Anaconda Prompt:</w:t>
+      <w:proofErr w:type="gramStart"/>
+      <w:r>
+        <w:t>Open</w:t>
+      </w:r>
+      <w:proofErr w:type="gramEnd"/>
+      <w:r>
+        <w:t xml:space="preserve"> a NEW Anaconda Prompt:</w:t>
+      </w:r>
+    </w:p>
+    <w:p>
+      <w:r>
+        <w:rPr>
+          <w:rFonts w:ascii="Courier New" w:hAnsi="Courier New"/>
+          <w:sz w:val="20"/>
+        </w:rPr>
+        <w:lastRenderedPageBreak/>
+        <w:t>cd Afterimage</w:t>
+      </w:r>
+    </w:p>
+    <w:p>
+      <w:proofErr w:type="spellStart"/>
+      <w:r>
+        <w:rPr>
+          <w:rFonts w:ascii="Courier New" w:hAnsi="Courier New"/>
+          <w:sz w:val="20"/>
+        </w:rPr>
+        <w:t>conda</w:t>
+      </w:r>
+      <w:proofErr w:type="spellEnd"/>
+      <w:r>
+        <w:rPr>
+          <w:rFonts w:ascii="Courier New" w:hAnsi="Courier New"/>
+          <w:sz w:val="20"/>
+        </w:rPr>
+        <w:t xml:space="preserve"> activate </w:t>
+      </w:r>
+      <w:proofErr w:type="spellStart"/>
+      <w:r>
+        <w:rPr>
+          <w:rFonts w:ascii="Courier New" w:hAnsi="Courier New"/>
+          <w:sz w:val="20"/>
+        </w:rPr>
+        <w:t>afterimage_env</w:t>
+      </w:r>
+      <w:proofErr w:type="spellEnd"/>
+    </w:p>
+    <w:p>
+      <w:proofErr w:type="spellStart"/>
+      <w:r>
+        <w:rPr>
+          <w:rFonts w:ascii="Courier New" w:hAnsi="Courier New"/>
+          <w:sz w:val="20"/>
+        </w:rPr>
+        <w:t>uvicorn</w:t>
+      </w:r>
+      <w:proofErr w:type="spellEnd"/>
+      <w:r>
+        <w:rPr>
+          <w:rFonts w:ascii="Courier New" w:hAnsi="Courier New"/>
+          <w:sz w:val="20"/>
+        </w:rPr>
+        <w:t xml:space="preserve"> </w:t>
+      </w:r>
+      <w:proofErr w:type="spellStart"/>
+      <w:proofErr w:type="gramStart"/>
+      <w:r>
+        <w:rPr>
+          <w:rFonts w:ascii="Courier New" w:hAnsi="Courier New"/>
+          <w:sz w:val="20"/>
+        </w:rPr>
+        <w:t>backend.main</w:t>
+      </w:r>
+      <w:proofErr w:type="gramEnd"/>
+      <w:r>
+        <w:rPr>
+          <w:rFonts w:ascii="Courier New" w:hAnsi="Courier New"/>
+          <w:sz w:val="20"/>
+        </w:rPr>
+        <w:t>:app</w:t>
+      </w:r>
+      <w:proofErr w:type="spellEnd"/>
+      <w:r>
+        <w:rPr>
+          <w:rFonts w:ascii="Courier New" w:hAnsi="Courier New"/>
+          <w:sz w:val="20"/>
+        </w:rPr>
+        <w:t xml:space="preserve"> --host 127.0.0.1 --port 9000</w:t>
+      </w:r>
+    </w:p>
+    <w:p>
+      <w:r>
+        <w:rPr>
+          <w:b/>
+          <w:sz w:val="28"/>
+        </w:rPr>
+        <w:t>9. Run Frontend</w:t>
+      </w:r>
+    </w:p>
+    <w:p>
+      <w:r>
+        <w:t>Open ANOTHER Anaconda Prompt:</w:t>
       </w:r>
     </w:p>
     <w:p>
@@ -616,90 +902,6 @@
           <w:rFonts w:ascii="Courier New" w:hAnsi="Courier New"/>
           <w:sz w:val="20"/>
         </w:rPr>
-        <w:t>uvicorn</w:t>
-      </w:r>
-      <w:proofErr w:type="spellEnd"/>
-      <w:r>
-        <w:rPr>
-          <w:rFonts w:ascii="Courier New" w:hAnsi="Courier New"/>
-          <w:sz w:val="20"/>
-        </w:rPr>
-        <w:t xml:space="preserve"> </w:t>
-      </w:r>
-      <w:proofErr w:type="spellStart"/>
-      <w:r>
-        <w:rPr>
-          <w:rFonts w:ascii="Courier New" w:hAnsi="Courier New"/>
-          <w:sz w:val="20"/>
-        </w:rPr>
-        <w:t>backend.main:app</w:t>
-      </w:r>
-      <w:proofErr w:type="spellEnd"/>
-      <w:r>
-        <w:rPr>
-          <w:rFonts w:ascii="Courier New" w:hAnsi="Courier New"/>
-          <w:sz w:val="20"/>
-        </w:rPr>
-        <w:t xml:space="preserve"> --host 127.0.0.1 --port 9000</w:t>
-      </w:r>
-    </w:p>
-    <w:p>
-      <w:r>
-        <w:rPr>
-          <w:b/>
-          <w:sz w:val="28"/>
-        </w:rPr>
-        <w:t>9. Run Frontend</w:t>
-      </w:r>
-    </w:p>
-    <w:p>
-      <w:r>
-        <w:t>Open ANOTHER Anaconda Prompt:</w:t>
-      </w:r>
-    </w:p>
-    <w:p>
-      <w:r>
-        <w:rPr>
-          <w:rFonts w:ascii="Courier New" w:hAnsi="Courier New"/>
-          <w:sz w:val="20"/>
-        </w:rPr>
-        <w:t>cd Afterimage</w:t>
-      </w:r>
-    </w:p>
-    <w:p>
-      <w:proofErr w:type="spellStart"/>
-      <w:r>
-        <w:rPr>
-          <w:rFonts w:ascii="Courier New" w:hAnsi="Courier New"/>
-          <w:sz w:val="20"/>
-        </w:rPr>
-        <w:t>conda</w:t>
-      </w:r>
-      <w:proofErr w:type="spellEnd"/>
-      <w:r>
-        <w:rPr>
-          <w:rFonts w:ascii="Courier New" w:hAnsi="Courier New"/>
-          <w:sz w:val="20"/>
-        </w:rPr>
-        <w:t xml:space="preserve"> activate </w:t>
-      </w:r>
-      <w:proofErr w:type="spellStart"/>
-      <w:r>
-        <w:rPr>
-          <w:rFonts w:ascii="Courier New" w:hAnsi="Courier New"/>
-          <w:sz w:val="20"/>
-        </w:rPr>
-        <w:t>afterimage_env</w:t>
-      </w:r>
-      <w:proofErr w:type="spellEnd"/>
-    </w:p>
-    <w:p>
-      <w:proofErr w:type="spellStart"/>
-      <w:r>
-        <w:rPr>
-          <w:rFonts w:ascii="Courier New" w:hAnsi="Courier New"/>
-          <w:sz w:val="20"/>
-        </w:rPr>
         <w:t>streamlit</w:t>
       </w:r>
       <w:proofErr w:type="spellEnd"/>
@@ -713,11 +915,169 @@
     </w:p>
     <w:p>
       <w:pPr>
+        <w:keepNext/>
+      </w:pPr>
+      <w:r>
         <w:rPr>
           <w:b/>
+          <w:noProof/>
           <w:sz w:val="28"/>
         </w:rPr>
+        <w:drawing>
+          <wp:inline distT="0" distB="0" distL="0" distR="0" wp14:anchorId="1A2115B5" wp14:editId="26F5A071">
+            <wp:extent cx="5486400" cy="660400"/>
+            <wp:effectExtent l="0" t="0" r="0" b="6350"/>
+            <wp:docPr id="1971602880" name="Picture 1"/>
+            <wp:cNvGraphicFramePr>
+              <a:graphicFrameLocks xmlns:a="http://schemas.openxmlformats.org/drawingml/2006/main" noChangeAspect="1"/>
+            </wp:cNvGraphicFramePr>
+            <a:graphic xmlns:a="http://schemas.openxmlformats.org/drawingml/2006/main">
+              <a:graphicData uri="http://schemas.openxmlformats.org/drawingml/2006/picture">
+                <pic:pic xmlns:pic="http://schemas.openxmlformats.org/drawingml/2006/picture">
+                  <pic:nvPicPr>
+                    <pic:cNvPr id="1971602880" name=""/>
+                    <pic:cNvPicPr/>
+                  </pic:nvPicPr>
+                  <pic:blipFill>
+                    <a:blip r:embed="rId12"/>
+                    <a:stretch>
+                      <a:fillRect/>
+                    </a:stretch>
+                  </pic:blipFill>
+                  <pic:spPr>
+                    <a:xfrm>
+                      <a:off x="0" y="0"/>
+                      <a:ext cx="5486400" cy="660400"/>
+                    </a:xfrm>
+                    <a:prstGeom prst="rect">
+                      <a:avLst/>
+                    </a:prstGeom>
+                  </pic:spPr>
+                </pic:pic>
+              </a:graphicData>
+            </a:graphic>
+          </wp:inline>
+        </w:drawing>
+      </w:r>
+    </w:p>
+    <w:p>
+      <w:pPr>
+        <w:pStyle w:val="Caption"/>
+        <w:jc w:val="center"/>
       </w:pPr>
+      <w:r>
+        <w:t xml:space="preserve">Figure </w:t>
+      </w:r>
+      <w:r>
+        <w:fldChar w:fldCharType="begin"/>
+      </w:r>
+      <w:r>
+        <w:instrText xml:space="preserve"> SEQ Figure \* ARABIC </w:instrText>
+      </w:r>
+      <w:r>
+        <w:fldChar w:fldCharType="separate"/>
+      </w:r>
+      <w:r>
+        <w:rPr>
+          <w:noProof/>
+        </w:rPr>
+        <w:t>3</w:t>
+      </w:r>
+      <w:r>
+        <w:fldChar w:fldCharType="end"/>
+      </w:r>
+      <w:r>
+        <w:t xml:space="preserve">: </w:t>
+      </w:r>
+      <w:r>
+        <w:t xml:space="preserve">The Afterimage system requires two concurrent terminal sessions. Ensure the backend server is fully initialized before interacting with the </w:t>
+      </w:r>
+      <w:proofErr w:type="spellStart"/>
+      <w:r>
+        <w:t>Streamlit</w:t>
+      </w:r>
+      <w:proofErr w:type="spellEnd"/>
+      <w:r>
+        <w:t xml:space="preserve"> frontend.</w:t>
+      </w:r>
+    </w:p>
+    <w:p>
+      <w:pPr>
+        <w:keepNext/>
+      </w:pPr>
+      <w:r>
+        <w:rPr>
+          <w:noProof/>
+        </w:rPr>
+        <w:drawing>
+          <wp:inline distT="0" distB="0" distL="0" distR="0" wp14:anchorId="7BC49F30" wp14:editId="4A6DEEC7">
+            <wp:extent cx="5022390" cy="4137660"/>
+            <wp:effectExtent l="0" t="0" r="6985" b="0"/>
+            <wp:docPr id="1389275867" name="Picture 1"/>
+            <wp:cNvGraphicFramePr>
+              <a:graphicFrameLocks xmlns:a="http://schemas.openxmlformats.org/drawingml/2006/main" noChangeAspect="1"/>
+            </wp:cNvGraphicFramePr>
+            <a:graphic xmlns:a="http://schemas.openxmlformats.org/drawingml/2006/main">
+              <a:graphicData uri="http://schemas.openxmlformats.org/drawingml/2006/picture">
+                <pic:pic xmlns:pic="http://schemas.openxmlformats.org/drawingml/2006/picture">
+                  <pic:nvPicPr>
+                    <pic:cNvPr id="1389275867" name=""/>
+                    <pic:cNvPicPr/>
+                  </pic:nvPicPr>
+                  <pic:blipFill>
+                    <a:blip r:embed="rId13"/>
+                    <a:stretch>
+                      <a:fillRect/>
+                    </a:stretch>
+                  </pic:blipFill>
+                  <pic:spPr>
+                    <a:xfrm>
+                      <a:off x="0" y="0"/>
+                      <a:ext cx="5034086" cy="4147296"/>
+                    </a:xfrm>
+                    <a:prstGeom prst="rect">
+                      <a:avLst/>
+                    </a:prstGeom>
+                  </pic:spPr>
+                </pic:pic>
+              </a:graphicData>
+            </a:graphic>
+          </wp:inline>
+        </w:drawing>
+      </w:r>
+    </w:p>
+    <w:p>
+      <w:pPr>
+        <w:pStyle w:val="Caption"/>
+        <w:jc w:val="center"/>
+      </w:pPr>
+      <w:r>
+        <w:t xml:space="preserve">Figure </w:t>
+      </w:r>
+      <w:r>
+        <w:fldChar w:fldCharType="begin"/>
+      </w:r>
+      <w:r>
+        <w:instrText xml:space="preserve"> SEQ Figure \* ARABIC </w:instrText>
+      </w:r>
+      <w:r>
+        <w:fldChar w:fldCharType="separate"/>
+      </w:r>
+      <w:r>
+        <w:rPr>
+          <w:noProof/>
+        </w:rPr>
+        <w:t>4</w:t>
+      </w:r>
+      <w:r>
+        <w:fldChar w:fldCharType="end"/>
+      </w:r>
+      <w:r>
+        <w:t xml:space="preserve">: </w:t>
+      </w:r>
+      <w:r>
+        <w:t>The Afterimage frontend. Select your target model from the dropdown menu and click "Confirm and Load Model" to unlock the image upload interface.</w:t>
+      </w:r>
     </w:p>
     <w:p>
       <w:r>
@@ -2267,7 +2627,6 @@
     <w:basedOn w:val="Normal"/>
     <w:next w:val="Normal"/>
     <w:uiPriority w:val="35"/>
-    <w:semiHidden/>
     <w:unhideWhenUsed/>
     <w:qFormat/>
     <w:rsid w:val="00FC693F"/>
@@ -12495,6 +12854,18 @@
     <w:rPr>
       <w:color w:val="605E5C"/>
       <w:shd w:val="clear" w:color="auto" w:fill="E1DFDD"/>
+    </w:rPr>
+  </w:style>
+  <w:style w:type="character" w:styleId="FollowedHyperlink">
+    <w:name w:val="FollowedHyperlink"/>
+    <w:basedOn w:val="DefaultParagraphFont"/>
+    <w:uiPriority w:val="99"/>
+    <w:semiHidden/>
+    <w:unhideWhenUsed/>
+    <w:rsid w:val="000D1CFB"/>
+    <w:rPr>
+      <w:color w:val="800080" w:themeColor="followedHyperlink"/>
+      <w:u w:val="single"/>
     </w:rPr>
   </w:style>
 </w:styles>

</xml_diff>